<commit_message>
Pilot guide .docx: clean Google-Doc style, drop monospace/code-block terminal look
</commit_message>
<xml_diff>
--- a/docs/qa_buddy_pilot_guide.docx
+++ b/docs/qa_buddy_pilot_guide.docx
@@ -634,7 +634,6 @@
     <w:p>
       <w:r>
         <w:rPr>
-          <w:rFonts w:ascii="Consolas" w:hAnsi="Consolas"/>
           <w:b w:val="0"/>
           <w:i w:val="0"/>
           <w:highlight w:val="yellow"/>
@@ -670,7 +669,6 @@
       </w:r>
       <w:r>
         <w:rPr>
-          <w:rFonts w:ascii="Consolas" w:hAnsi="Consolas"/>
           <w:b w:val="0"/>
           <w:i w:val="0"/>
         </w:rPr>
@@ -702,13 +700,10 @@
     </w:p>
     <w:p>
       <w:pPr>
-        <w:shd w:val="clear" w:fill="F2F2F2"/>
+        <w:ind w:left="432"/>
+        <w:shd w:val="clear" w:fill="F4F6F8"/>
       </w:pPr>
       <w:r>
-        <w:rPr>
-          <w:rFonts w:ascii="Consolas" w:hAnsi="Consolas"/>
-          <w:sz w:val="20"/>
-        </w:rPr>
         <w:t>ppc-qa-buddy@prj-prd-ai-ppc-qa-pkph.iam.gserviceaccount.com</w:t>
       </w:r>
     </w:p>
@@ -860,7 +855,6 @@
           <w:p>
             <w:r>
               <w:rPr>
-                <w:rFonts w:ascii="Consolas" w:hAnsi="Consolas"/>
                 <w:b w:val="0"/>
                 <w:i w:val="0"/>
               </w:rPr>
@@ -875,7 +869,6 @@
             </w:r>
             <w:r>
               <w:rPr>
-                <w:rFonts w:ascii="Consolas" w:hAnsi="Consolas"/>
                 <w:b w:val="0"/>
                 <w:i w:val="0"/>
               </w:rPr>
@@ -890,7 +883,6 @@
             </w:r>
             <w:r>
               <w:rPr>
-                <w:rFonts w:ascii="Consolas" w:hAnsi="Consolas"/>
                 <w:b w:val="0"/>
                 <w:i w:val="0"/>
               </w:rPr>
@@ -921,7 +913,6 @@
           <w:p>
             <w:r>
               <w:rPr>
-                <w:rFonts w:ascii="Consolas" w:hAnsi="Consolas"/>
                 <w:b w:val="0"/>
                 <w:i w:val="0"/>
               </w:rPr>
@@ -936,7 +927,6 @@
             </w:r>
             <w:r>
               <w:rPr>
-                <w:rFonts w:ascii="Consolas" w:hAnsi="Consolas"/>
                 <w:b w:val="0"/>
                 <w:i w:val="0"/>
               </w:rPr>
@@ -951,7 +941,6 @@
           <w:p>
             <w:r>
               <w:rPr>
-                <w:rFonts w:ascii="Consolas" w:hAnsi="Consolas"/>
                 <w:b w:val="0"/>
                 <w:i w:val="0"/>
               </w:rPr>
@@ -989,7 +978,6 @@
             </w:r>
             <w:r>
               <w:rPr>
-                <w:rFonts w:ascii="Consolas" w:hAnsi="Consolas"/>
                 <w:b w:val="0"/>
                 <w:i w:val="0"/>
               </w:rPr>
@@ -1004,7 +992,6 @@
           <w:p>
             <w:r>
               <w:rPr>
-                <w:rFonts w:ascii="Consolas" w:hAnsi="Consolas"/>
                 <w:b w:val="0"/>
                 <w:i w:val="0"/>
               </w:rPr>
@@ -1049,7 +1036,6 @@
           <w:p>
             <w:r>
               <w:rPr>
-                <w:rFonts w:ascii="Consolas" w:hAnsi="Consolas"/>
                 <w:b w:val="0"/>
                 <w:i w:val="0"/>
               </w:rPr>
@@ -1064,7 +1050,6 @@
             </w:r>
             <w:r>
               <w:rPr>
-                <w:rFonts w:ascii="Consolas" w:hAnsi="Consolas"/>
                 <w:b w:val="0"/>
                 <w:i w:val="0"/>
               </w:rPr>
@@ -1095,7 +1080,6 @@
           <w:p>
             <w:r>
               <w:rPr>
-                <w:rFonts w:ascii="Consolas" w:hAnsi="Consolas"/>
                 <w:b w:val="0"/>
                 <w:i w:val="0"/>
               </w:rPr>
@@ -1110,7 +1094,6 @@
             </w:r>
             <w:r>
               <w:rPr>
-                <w:rFonts w:ascii="Consolas" w:hAnsi="Consolas"/>
                 <w:b w:val="0"/>
                 <w:i w:val="0"/>
               </w:rPr>
@@ -1125,7 +1108,6 @@
             </w:r>
             <w:r>
               <w:rPr>
-                <w:rFonts w:ascii="Consolas" w:hAnsi="Consolas"/>
                 <w:b w:val="0"/>
                 <w:i w:val="0"/>
               </w:rPr>
@@ -1140,7 +1122,6 @@
           <w:p>
             <w:r>
               <w:rPr>
-                <w:rFonts w:ascii="Consolas" w:hAnsi="Consolas"/>
                 <w:b w:val="0"/>
                 <w:i w:val="0"/>
               </w:rPr>
@@ -1185,7 +1166,6 @@
           <w:p>
             <w:r>
               <w:rPr>
-                <w:rFonts w:ascii="Consolas" w:hAnsi="Consolas"/>
                 <w:b w:val="0"/>
                 <w:i w:val="0"/>
               </w:rPr>
@@ -1200,7 +1180,6 @@
             </w:r>
             <w:r>
               <w:rPr>
-                <w:rFonts w:ascii="Consolas" w:hAnsi="Consolas"/>
                 <w:b w:val="0"/>
                 <w:i w:val="0"/>
               </w:rPr>
@@ -1245,7 +1224,6 @@
           <w:p>
             <w:r>
               <w:rPr>
-                <w:rFonts w:ascii="Consolas" w:hAnsi="Consolas"/>
                 <w:b w:val="0"/>
                 <w:i w:val="0"/>
               </w:rPr>
@@ -1290,7 +1268,6 @@
           <w:p>
             <w:r>
               <w:rPr>
-                <w:rFonts w:ascii="Consolas" w:hAnsi="Consolas"/>
                 <w:b w:val="0"/>
                 <w:i w:val="0"/>
               </w:rPr>
@@ -1335,7 +1312,6 @@
           <w:p>
             <w:r>
               <w:rPr>
-                <w:rFonts w:ascii="Consolas" w:hAnsi="Consolas"/>
                 <w:b w:val="0"/>
                 <w:i w:val="0"/>
               </w:rPr>
@@ -1366,7 +1342,6 @@
           <w:p>
             <w:r>
               <w:rPr>
-                <w:rFonts w:ascii="Consolas" w:hAnsi="Consolas"/>
                 <w:b w:val="0"/>
                 <w:i w:val="0"/>
               </w:rPr>
@@ -1381,7 +1356,6 @@
             </w:r>
             <w:r>
               <w:rPr>
-                <w:rFonts w:ascii="Consolas" w:hAnsi="Consolas"/>
                 <w:b w:val="0"/>
                 <w:i w:val="0"/>
               </w:rPr>
@@ -1396,7 +1370,6 @@
           <w:p>
             <w:r>
               <w:rPr>
-                <w:rFonts w:ascii="Consolas" w:hAnsi="Consolas"/>
                 <w:b w:val="0"/>
                 <w:i w:val="0"/>
               </w:rPr>
@@ -1441,7 +1414,6 @@
           <w:p>
             <w:r>
               <w:rPr>
-                <w:rFonts w:ascii="Consolas" w:hAnsi="Consolas"/>
                 <w:b w:val="0"/>
                 <w:i w:val="0"/>
               </w:rPr>
@@ -1578,7 +1550,6 @@
       </w:r>
       <w:r>
         <w:rPr>
-          <w:rFonts w:ascii="Consolas" w:hAnsi="Consolas"/>
           <w:b w:val="0"/>
           <w:i w:val="0"/>
           <w:highlight w:val="yellow"/>
@@ -1595,12 +1566,11 @@
     </w:p>
     <w:p>
       <w:pPr>
-        <w:shd w:val="clear" w:fill="F2F2F2"/>
+        <w:ind w:left="432"/>
+        <w:shd w:val="clear" w:fill="F4F6F8"/>
       </w:pPr>
       <w:r>
         <w:rPr>
-          <w:rFonts w:ascii="Consolas" w:hAnsi="Consolas"/>
-          <w:sz w:val="20"/>
           <w:highlight w:val="yellow"/>
         </w:rPr>
         <w:t>[TODO: bot handle, e.g. @Social QA Test]</w:t>
@@ -1609,30 +1579,18 @@
         <w:br/>
       </w:r>
       <w:r>
-        <w:rPr>
-          <w:rFonts w:ascii="Consolas" w:hAnsi="Consolas"/>
-          <w:sz w:val="20"/>
-        </w:rPr>
         <w:t>Account_id: &lt;your Meta ad account id&gt;</w:t>
       </w:r>
       <w:r>
         <w:br/>
       </w:r>
       <w:r>
-        <w:rPr>
-          <w:rFonts w:ascii="Consolas" w:hAnsi="Consolas"/>
-          <w:sz w:val="20"/>
-        </w:rPr>
         <w:t>Campaign_id: &lt;your Meta campaign id&gt;</w:t>
       </w:r>
       <w:r>
         <w:br/>
       </w:r>
       <w:r>
-        <w:rPr>
-          <w:rFonts w:ascii="Consolas" w:hAnsi="Consolas"/>
-          <w:sz w:val="20"/>
-        </w:rPr>
         <w:t>Sheet_url: &lt;the link to your copy&gt;</w:t>
       </w:r>
     </w:p>
@@ -1665,7 +1623,6 @@
       </w:r>
       <w:r>
         <w:rPr>
-          <w:rFonts w:ascii="Consolas" w:hAnsi="Consolas"/>
           <w:b w:val="0"/>
           <w:i w:val="0"/>
         </w:rPr>
@@ -1775,7 +1732,6 @@
       </w:r>
       <w:r>
         <w:rPr>
-          <w:rFonts w:ascii="Consolas" w:hAnsi="Consolas"/>
           <w:b w:val="0"/>
           <w:i w:val="0"/>
         </w:rPr>
@@ -2065,7 +2021,6 @@
             </w:r>
             <w:r>
               <w:rPr>
-                <w:rFonts w:ascii="Consolas" w:hAnsi="Consolas"/>
                 <w:b w:val="0"/>
                 <w:i w:val="0"/>
               </w:rPr>
@@ -2110,7 +2065,6 @@
             </w:r>
             <w:r>
               <w:rPr>
-                <w:rFonts w:ascii="Consolas" w:hAnsi="Consolas"/>
                 <w:b w:val="0"/>
                 <w:i w:val="0"/>
               </w:rPr>
@@ -2141,7 +2095,6 @@
             </w:r>
             <w:r>
               <w:rPr>
-                <w:rFonts w:ascii="Consolas" w:hAnsi="Consolas"/>
                 <w:b w:val="0"/>
                 <w:i w:val="0"/>
               </w:rPr>
@@ -2248,7 +2201,6 @@
       </w:r>
       <w:r>
         <w:rPr>
-          <w:rFonts w:ascii="Consolas" w:hAnsi="Consolas"/>
           <w:b w:val="0"/>
           <w:i w:val="0"/>
         </w:rPr>
@@ -2373,7 +2325,6 @@
       </w:r>
       <w:r>
         <w:rPr>
-          <w:rFonts w:ascii="Consolas" w:hAnsi="Consolas"/>
           <w:b w:val="0"/>
           <w:i w:val="0"/>
           <w:highlight w:val="yellow"/>
@@ -2401,7 +2352,6 @@
       </w:r>
       <w:r>
         <w:rPr>
-          <w:rFonts w:ascii="Consolas" w:hAnsi="Consolas"/>
           <w:b w:val="0"/>
           <w:i w:val="0"/>
         </w:rPr>
@@ -2428,7 +2378,6 @@
       </w:r>
       <w:r>
         <w:rPr>
-          <w:rFonts w:ascii="Consolas" w:hAnsi="Consolas"/>
           <w:b w:val="0"/>
           <w:i w:val="0"/>
           <w:highlight w:val="yellow"/>
@@ -2444,7 +2393,6 @@
       </w:r>
       <w:r>
         <w:rPr>
-          <w:rFonts w:ascii="Consolas" w:hAnsi="Consolas"/>
           <w:b w:val="0"/>
           <w:i w:val="0"/>
         </w:rPr>
@@ -2459,7 +2407,6 @@
       </w:r>
       <w:r>
         <w:rPr>
-          <w:rFonts w:ascii="Consolas" w:hAnsi="Consolas"/>
           <w:b w:val="0"/>
           <w:i w:val="0"/>
         </w:rPr>
@@ -2474,7 +2421,6 @@
       </w:r>
       <w:r>
         <w:rPr>
-          <w:rFonts w:ascii="Consolas" w:hAnsi="Consolas"/>
           <w:b w:val="0"/>
           <w:i w:val="0"/>
         </w:rPr>

</xml_diff>